<commit_message>
3.1.C.A.1-fix: Arial v shablonah Logistiks Rus + summy propisyu (sum_*_words)
</commit_message>
<xml_diff>
--- a/templates/shablon_logistiks_rus_ip.docx
+++ b/templates/shablon_logistiks_rus_ip.docx
@@ -8,7 +8,7 @@
       </w:pPr>
       <w:r>
         <w:rPr>
-          <w:rFonts w:ascii="Times New Roman" w:hAnsi="Times New Roman" w:cs="Times New Roman" w:eastAsia="Times New Roman"/>
+          <w:rFonts w:ascii="Arial" w:hAnsi="Arial" w:cs="Arial" w:eastAsia="Arial"/>
           <w:b/>
           <w:sz w:val="24"/>
           <w:u w:val="none"/>
@@ -22,7 +22,7 @@
       </w:pPr>
       <w:r>
         <w:rPr>
-          <w:rFonts w:ascii="Times New Roman" w:hAnsi="Times New Roman" w:cs="Times New Roman" w:eastAsia="Times New Roman"/>
+          <w:rFonts w:ascii="Arial" w:hAnsi="Arial" w:cs="Arial" w:eastAsia="Arial"/>
           <w:b w:val="0"/>
           <w:sz w:val="24"/>
           <w:u w:val="none"/>
@@ -32,7 +32,7 @@
       </w:r>
       <w:r>
         <w:rPr>
-          <w:rFonts w:ascii="Times New Roman" w:hAnsi="Times New Roman" w:cs="Times New Roman" w:eastAsia="Times New Roman"/>
+          <w:rFonts w:ascii="Arial" w:hAnsi="Arial" w:cs="Arial" w:eastAsia="Arial"/>
           <w:b w:val="0"/>
           <w:sz w:val="24"/>
           <w:u w:val="none"/>
@@ -47,7 +47,7 @@
       </w:pPr>
       <w:r>
         <w:rPr>
-          <w:rFonts w:ascii="Times New Roman" w:hAnsi="Times New Roman" w:cs="Times New Roman" w:eastAsia="Times New Roman"/>
+          <w:rFonts w:ascii="Arial" w:hAnsi="Arial" w:cs="Arial" w:eastAsia="Arial"/>
           <w:b/>
           <w:sz w:val="24"/>
           <w:u w:val="none"/>
@@ -56,7 +56,7 @@
       </w:r>
       <w:r>
         <w:rPr>
-          <w:rFonts w:ascii="Times New Roman" w:hAnsi="Times New Roman" w:cs="Times New Roman" w:eastAsia="Times New Roman"/>
+          <w:rFonts w:ascii="Arial" w:hAnsi="Arial" w:cs="Arial" w:eastAsia="Arial"/>
           <w:b/>
           <w:sz w:val="24"/>
           <w:u w:val="none"/>
@@ -71,7 +71,7 @@
       </w:pPr>
       <w:r>
         <w:rPr>
-          <w:rFonts w:ascii="Times New Roman" w:hAnsi="Times New Roman" w:cs="Times New Roman" w:eastAsia="Times New Roman"/>
+          <w:rFonts w:ascii="Arial" w:hAnsi="Arial" w:cs="Arial" w:eastAsia="Arial"/>
           <w:b/>
           <w:sz w:val="24"/>
           <w:u w:val="none"/>
@@ -85,7 +85,7 @@
       </w:pPr>
       <w:r>
         <w:rPr>
-          <w:rFonts w:ascii="Times New Roman" w:hAnsi="Times New Roman" w:cs="Times New Roman" w:eastAsia="Times New Roman"/>
+          <w:rFonts w:ascii="Arial" w:hAnsi="Arial" w:cs="Arial" w:eastAsia="Arial"/>
           <w:b w:val="0"/>
           <w:sz w:val="24"/>
           <w:u w:val="none"/>
@@ -94,7 +94,7 @@
       </w:r>
       <w:r>
         <w:rPr>
-          <w:rFonts w:ascii="Times New Roman" w:hAnsi="Times New Roman" w:cs="Times New Roman" w:eastAsia="Times New Roman"/>
+          <w:rFonts w:ascii="Arial" w:hAnsi="Arial" w:cs="Arial" w:eastAsia="Arial"/>
           <w:b w:val="0"/>
           <w:sz w:val="24"/>
           <w:u w:val="none"/>
@@ -103,7 +103,7 @@
       </w:r>
       <w:r>
         <w:rPr>
-          <w:rFonts w:ascii="Times New Roman" w:hAnsi="Times New Roman" w:cs="Times New Roman" w:eastAsia="Times New Roman"/>
+          <w:rFonts w:ascii="Arial" w:hAnsi="Arial" w:cs="Arial" w:eastAsia="Arial"/>
           <w:b w:val="0"/>
           <w:sz w:val="24"/>
           <w:u w:val="none"/>
@@ -112,7 +112,7 @@
       </w:r>
       <w:r>
         <w:rPr>
-          <w:rFonts w:ascii="Times New Roman" w:hAnsi="Times New Roman" w:cs="Times New Roman" w:eastAsia="Times New Roman"/>
+          <w:rFonts w:ascii="Arial" w:hAnsi="Arial" w:cs="Arial" w:eastAsia="Arial"/>
           <w:b w:val="0"/>
           <w:sz w:val="24"/>
           <w:u w:val="none"/>
@@ -121,7 +121,7 @@
       </w:r>
       <w:r>
         <w:rPr>
-          <w:rFonts w:ascii="Times New Roman" w:hAnsi="Times New Roman" w:cs="Times New Roman" w:eastAsia="Times New Roman"/>
+          <w:rFonts w:ascii="Arial" w:hAnsi="Arial" w:cs="Arial" w:eastAsia="Arial"/>
           <w:b w:val="0"/>
           <w:sz w:val="24"/>
           <w:u w:val="none"/>
@@ -130,7 +130,7 @@
       </w:r>
       <w:r>
         <w:rPr>
-          <w:rFonts w:ascii="Times New Roman" w:hAnsi="Times New Roman" w:cs="Times New Roman" w:eastAsia="Times New Roman"/>
+          <w:rFonts w:ascii="Arial" w:hAnsi="Arial" w:cs="Arial" w:eastAsia="Arial"/>
           <w:b w:val="0"/>
           <w:sz w:val="24"/>
           <w:u w:val="none"/>
@@ -139,7 +139,7 @@
       </w:r>
       <w:r>
         <w:rPr>
-          <w:rFonts w:ascii="Times New Roman" w:hAnsi="Times New Roman" w:cs="Times New Roman" w:eastAsia="Times New Roman"/>
+          <w:rFonts w:ascii="Arial" w:hAnsi="Arial" w:cs="Arial" w:eastAsia="Arial"/>
           <w:b w:val="0"/>
           <w:sz w:val="24"/>
           <w:u w:val="none"/>
@@ -153,7 +153,7 @@
       </w:pPr>
       <w:r>
         <w:rPr>
-          <w:rFonts w:ascii="Times New Roman" w:hAnsi="Times New Roman" w:cs="Times New Roman" w:eastAsia="Times New Roman"/>
+          <w:rFonts w:ascii="Arial" w:hAnsi="Arial" w:cs="Arial" w:eastAsia="Arial"/>
           <w:b/>
           <w:sz w:val="24"/>
           <w:u w:val="none"/>
@@ -162,7 +162,7 @@
       </w:r>
       <w:r>
         <w:rPr>
-          <w:rFonts w:ascii="Times New Roman" w:hAnsi="Times New Roman" w:cs="Times New Roman" w:eastAsia="Times New Roman"/>
+          <w:rFonts w:ascii="Arial" w:hAnsi="Arial" w:cs="Arial" w:eastAsia="Arial"/>
           <w:b w:val="0"/>
           <w:sz w:val="24"/>
           <w:u w:val="none"/>
@@ -172,7 +172,7 @@
       </w:r>
       <w:r>
         <w:rPr>
-          <w:rFonts w:ascii="Times New Roman" w:hAnsi="Times New Roman" w:cs="Times New Roman" w:eastAsia="Times New Roman"/>
+          <w:rFonts w:ascii="Arial" w:hAnsi="Arial" w:cs="Arial" w:eastAsia="Arial"/>
           <w:b/>
           <w:sz w:val="24"/>
           <w:u w:val="none"/>
@@ -181,7 +181,7 @@
       </w:r>
       <w:r>
         <w:rPr>
-          <w:rFonts w:ascii="Times New Roman" w:hAnsi="Times New Roman" w:cs="Times New Roman" w:eastAsia="Times New Roman"/>
+          <w:rFonts w:ascii="Arial" w:hAnsi="Arial" w:cs="Arial" w:eastAsia="Arial"/>
           <w:b w:val="0"/>
           <w:sz w:val="24"/>
           <w:u w:val="none"/>
@@ -195,7 +195,7 @@
       </w:pPr>
       <w:r>
         <w:rPr>
-          <w:rFonts w:ascii="Times New Roman" w:hAnsi="Times New Roman" w:cs="Times New Roman" w:eastAsia="Times New Roman"/>
+          <w:rFonts w:ascii="Arial" w:hAnsi="Arial" w:cs="Arial" w:eastAsia="Arial"/>
           <w:b/>
           <w:sz w:val="24"/>
           <w:u w:val="none"/>
@@ -209,7 +209,7 @@
       </w:pPr>
       <w:r>
         <w:rPr>
-          <w:rFonts w:ascii="Times New Roman" w:hAnsi="Times New Roman" w:cs="Times New Roman" w:eastAsia="Times New Roman"/>
+          <w:rFonts w:ascii="Arial" w:hAnsi="Arial" w:cs="Arial" w:eastAsia="Arial"/>
           <w:b/>
           <w:sz w:val="24"/>
           <w:u w:val="none"/>
@@ -218,7 +218,7 @@
       </w:r>
       <w:r>
         <w:rPr>
-          <w:rFonts w:ascii="Times New Roman" w:hAnsi="Times New Roman" w:cs="Times New Roman" w:eastAsia="Times New Roman"/>
+          <w:rFonts w:ascii="Arial" w:hAnsi="Arial" w:cs="Arial" w:eastAsia="Arial"/>
           <w:b w:val="0"/>
           <w:sz w:val="24"/>
           <w:u w:val="none"/>
@@ -232,7 +232,7 @@
       </w:pPr>
       <w:r>
         <w:rPr>
-          <w:rFonts w:ascii="Times New Roman" w:hAnsi="Times New Roman" w:cs="Times New Roman" w:eastAsia="Times New Roman"/>
+          <w:rFonts w:ascii="Arial" w:hAnsi="Arial" w:cs="Arial" w:eastAsia="Arial"/>
           <w:b/>
           <w:sz w:val="24"/>
           <w:u w:val="none"/>
@@ -241,7 +241,7 @@
       </w:r>
       <w:r>
         <w:rPr>
-          <w:rFonts w:ascii="Times New Roman" w:hAnsi="Times New Roman" w:cs="Times New Roman" w:eastAsia="Times New Roman"/>
+          <w:rFonts w:ascii="Arial" w:hAnsi="Arial" w:cs="Arial" w:eastAsia="Arial"/>
           <w:b w:val="0"/>
           <w:sz w:val="24"/>
           <w:u w:val="none"/>
@@ -255,7 +255,7 @@
       </w:pPr>
       <w:r>
         <w:rPr>
-          <w:rFonts w:ascii="Times New Roman" w:hAnsi="Times New Roman" w:cs="Times New Roman" w:eastAsia="Times New Roman"/>
+          <w:rFonts w:ascii="Arial" w:hAnsi="Arial" w:cs="Arial" w:eastAsia="Arial"/>
           <w:b/>
           <w:sz w:val="24"/>
           <w:u w:val="none"/>
@@ -264,7 +264,7 @@
       </w:r>
       <w:r>
         <w:rPr>
-          <w:rFonts w:ascii="Times New Roman" w:hAnsi="Times New Roman" w:cs="Times New Roman" w:eastAsia="Times New Roman"/>
+          <w:rFonts w:ascii="Arial" w:hAnsi="Arial" w:cs="Arial" w:eastAsia="Arial"/>
           <w:b w:val="0"/>
           <w:sz w:val="24"/>
           <w:u w:val="none"/>
@@ -278,7 +278,7 @@
       </w:pPr>
       <w:r>
         <w:rPr>
-          <w:rFonts w:ascii="Times New Roman" w:hAnsi="Times New Roman" w:cs="Times New Roman" w:eastAsia="Times New Roman"/>
+          <w:rFonts w:ascii="Arial" w:hAnsi="Arial" w:cs="Arial" w:eastAsia="Arial"/>
           <w:b/>
           <w:sz w:val="24"/>
           <w:u w:val="none"/>
@@ -287,7 +287,7 @@
       </w:r>
       <w:r>
         <w:rPr>
-          <w:rFonts w:ascii="Times New Roman" w:hAnsi="Times New Roman" w:cs="Times New Roman" w:eastAsia="Times New Roman"/>
+          <w:rFonts w:ascii="Arial" w:hAnsi="Arial" w:cs="Arial" w:eastAsia="Arial"/>
           <w:b w:val="0"/>
           <w:sz w:val="24"/>
           <w:u w:val="none"/>
@@ -301,7 +301,7 @@
       </w:pPr>
       <w:r>
         <w:rPr>
-          <w:rFonts w:ascii="Times New Roman" w:hAnsi="Times New Roman" w:cs="Times New Roman" w:eastAsia="Times New Roman"/>
+          <w:rFonts w:ascii="Arial" w:hAnsi="Arial" w:cs="Arial" w:eastAsia="Arial"/>
           <w:b/>
           <w:sz w:val="24"/>
           <w:u w:val="none"/>
@@ -310,7 +310,7 @@
       </w:r>
       <w:r>
         <w:rPr>
-          <w:rFonts w:ascii="Times New Roman" w:hAnsi="Times New Roman" w:cs="Times New Roman" w:eastAsia="Times New Roman"/>
+          <w:rFonts w:ascii="Arial" w:hAnsi="Arial" w:cs="Arial" w:eastAsia="Arial"/>
           <w:b w:val="0"/>
           <w:sz w:val="24"/>
           <w:u w:val="none"/>
@@ -324,7 +324,7 @@
       </w:pPr>
       <w:r>
         <w:rPr>
-          <w:rFonts w:ascii="Times New Roman" w:hAnsi="Times New Roman" w:cs="Times New Roman" w:eastAsia="Times New Roman"/>
+          <w:rFonts w:ascii="Arial" w:hAnsi="Arial" w:cs="Arial" w:eastAsia="Arial"/>
           <w:b/>
           <w:sz w:val="24"/>
           <w:u w:val="none"/>
@@ -333,7 +333,7 @@
       </w:r>
       <w:r>
         <w:rPr>
-          <w:rFonts w:ascii="Times New Roman" w:hAnsi="Times New Roman" w:cs="Times New Roman" w:eastAsia="Times New Roman"/>
+          <w:rFonts w:ascii="Arial" w:hAnsi="Arial" w:cs="Arial" w:eastAsia="Arial"/>
           <w:b w:val="0"/>
           <w:sz w:val="24"/>
           <w:u w:val="none"/>
@@ -347,7 +347,7 @@
       </w:pPr>
       <w:r>
         <w:rPr>
-          <w:rFonts w:ascii="Times New Roman" w:hAnsi="Times New Roman" w:cs="Times New Roman" w:eastAsia="Times New Roman"/>
+          <w:rFonts w:ascii="Arial" w:hAnsi="Arial" w:cs="Arial" w:eastAsia="Arial"/>
           <w:b/>
           <w:sz w:val="24"/>
           <w:u w:val="none"/>
@@ -356,7 +356,7 @@
       </w:r>
       <w:r>
         <w:rPr>
-          <w:rFonts w:ascii="Times New Roman" w:hAnsi="Times New Roman" w:cs="Times New Roman" w:eastAsia="Times New Roman"/>
+          <w:rFonts w:ascii="Arial" w:hAnsi="Arial" w:cs="Arial" w:eastAsia="Arial"/>
           <w:b w:val="0"/>
           <w:sz w:val="24"/>
           <w:u w:val="none"/>
@@ -370,7 +370,7 @@
       </w:pPr>
       <w:r>
         <w:rPr>
-          <w:rFonts w:ascii="Times New Roman" w:hAnsi="Times New Roman" w:cs="Times New Roman" w:eastAsia="Times New Roman"/>
+          <w:rFonts w:ascii="Arial" w:hAnsi="Arial" w:cs="Arial" w:eastAsia="Arial"/>
           <w:b/>
           <w:sz w:val="24"/>
           <w:u w:val="none"/>
@@ -379,7 +379,7 @@
       </w:r>
       <w:r>
         <w:rPr>
-          <w:rFonts w:ascii="Times New Roman" w:hAnsi="Times New Roman" w:cs="Times New Roman" w:eastAsia="Times New Roman"/>
+          <w:rFonts w:ascii="Arial" w:hAnsi="Arial" w:cs="Arial" w:eastAsia="Arial"/>
           <w:b w:val="0"/>
           <w:sz w:val="24"/>
           <w:u w:val="none"/>
@@ -393,7 +393,7 @@
       </w:pPr>
       <w:r>
         <w:rPr>
-          <w:rFonts w:ascii="Times New Roman" w:hAnsi="Times New Roman" w:cs="Times New Roman" w:eastAsia="Times New Roman"/>
+          <w:rFonts w:ascii="Arial" w:hAnsi="Arial" w:cs="Arial" w:eastAsia="Arial"/>
           <w:b/>
           <w:sz w:val="24"/>
           <w:u w:val="none"/>
@@ -402,7 +402,7 @@
       </w:r>
       <w:r>
         <w:rPr>
-          <w:rFonts w:ascii="Times New Roman" w:hAnsi="Times New Roman" w:cs="Times New Roman" w:eastAsia="Times New Roman"/>
+          <w:rFonts w:ascii="Arial" w:hAnsi="Arial" w:cs="Arial" w:eastAsia="Arial"/>
           <w:b w:val="0"/>
           <w:sz w:val="24"/>
           <w:u w:val="none"/>
@@ -416,7 +416,7 @@
       </w:pPr>
       <w:r>
         <w:rPr>
-          <w:rFonts w:ascii="Times New Roman" w:hAnsi="Times New Roman" w:cs="Times New Roman" w:eastAsia="Times New Roman"/>
+          <w:rFonts w:ascii="Arial" w:hAnsi="Arial" w:cs="Arial" w:eastAsia="Arial"/>
           <w:b/>
           <w:sz w:val="24"/>
           <w:u w:val="none"/>
@@ -425,7 +425,7 @@
       </w:r>
       <w:r>
         <w:rPr>
-          <w:rFonts w:ascii="Times New Roman" w:hAnsi="Times New Roman" w:cs="Times New Roman" w:eastAsia="Times New Roman"/>
+          <w:rFonts w:ascii="Arial" w:hAnsi="Arial" w:cs="Arial" w:eastAsia="Arial"/>
           <w:b w:val="0"/>
           <w:sz w:val="24"/>
           <w:u w:val="none"/>
@@ -439,7 +439,7 @@
       </w:pPr>
       <w:r>
         <w:rPr>
-          <w:rFonts w:ascii="Times New Roman" w:hAnsi="Times New Roman" w:cs="Times New Roman" w:eastAsia="Times New Roman"/>
+          <w:rFonts w:ascii="Arial" w:hAnsi="Arial" w:cs="Arial" w:eastAsia="Arial"/>
           <w:b/>
           <w:sz w:val="24"/>
           <w:u w:val="none"/>
@@ -448,7 +448,7 @@
       </w:r>
       <w:r>
         <w:rPr>
-          <w:rFonts w:ascii="Times New Roman" w:hAnsi="Times New Roman" w:cs="Times New Roman" w:eastAsia="Times New Roman"/>
+          <w:rFonts w:ascii="Arial" w:hAnsi="Arial" w:cs="Arial" w:eastAsia="Arial"/>
           <w:b w:val="0"/>
           <w:sz w:val="24"/>
           <w:u w:val="none"/>
@@ -462,7 +462,7 @@
       </w:pPr>
       <w:r>
         <w:rPr>
-          <w:rFonts w:ascii="Times New Roman" w:hAnsi="Times New Roman" w:cs="Times New Roman" w:eastAsia="Times New Roman"/>
+          <w:rFonts w:ascii="Arial" w:hAnsi="Arial" w:cs="Arial" w:eastAsia="Arial"/>
           <w:b/>
           <w:sz w:val="24"/>
           <w:u w:val="none"/>
@@ -471,7 +471,7 @@
       </w:r>
       <w:r>
         <w:rPr>
-          <w:rFonts w:ascii="Times New Roman" w:hAnsi="Times New Roman" w:cs="Times New Roman" w:eastAsia="Times New Roman"/>
+          <w:rFonts w:ascii="Arial" w:hAnsi="Arial" w:cs="Arial" w:eastAsia="Arial"/>
           <w:b w:val="0"/>
           <w:sz w:val="24"/>
           <w:u w:val="none"/>
@@ -485,7 +485,7 @@
       </w:pPr>
       <w:r>
         <w:rPr>
-          <w:rFonts w:ascii="Times New Roman" w:hAnsi="Times New Roman" w:cs="Times New Roman" w:eastAsia="Times New Roman"/>
+          <w:rFonts w:ascii="Arial" w:hAnsi="Arial" w:cs="Arial" w:eastAsia="Arial"/>
           <w:b/>
           <w:sz w:val="24"/>
           <w:u w:val="none"/>
@@ -494,7 +494,7 @@
       </w:r>
       <w:r>
         <w:rPr>
-          <w:rFonts w:ascii="Times New Roman" w:hAnsi="Times New Roman" w:cs="Times New Roman" w:eastAsia="Times New Roman"/>
+          <w:rFonts w:ascii="Arial" w:hAnsi="Arial" w:cs="Arial" w:eastAsia="Arial"/>
           <w:b w:val="0"/>
           <w:sz w:val="24"/>
           <w:u w:val="none"/>
@@ -508,7 +508,7 @@
       </w:pPr>
       <w:r>
         <w:rPr>
-          <w:rFonts w:ascii="Times New Roman" w:hAnsi="Times New Roman" w:cs="Times New Roman" w:eastAsia="Times New Roman"/>
+          <w:rFonts w:ascii="Arial" w:hAnsi="Arial" w:cs="Arial" w:eastAsia="Arial"/>
           <w:b/>
           <w:sz w:val="24"/>
           <w:u w:val="none"/>
@@ -517,7 +517,7 @@
       </w:r>
       <w:r>
         <w:rPr>
-          <w:rFonts w:ascii="Times New Roman" w:hAnsi="Times New Roman" w:cs="Times New Roman" w:eastAsia="Times New Roman"/>
+          <w:rFonts w:ascii="Arial" w:hAnsi="Arial" w:cs="Arial" w:eastAsia="Arial"/>
           <w:b w:val="0"/>
           <w:sz w:val="24"/>
           <w:u w:val="none"/>
@@ -531,7 +531,7 @@
       </w:pPr>
       <w:r>
         <w:rPr>
-          <w:rFonts w:ascii="Times New Roman" w:hAnsi="Times New Roman" w:cs="Times New Roman" w:eastAsia="Times New Roman"/>
+          <w:rFonts w:ascii="Arial" w:hAnsi="Arial" w:cs="Arial" w:eastAsia="Arial"/>
           <w:b/>
           <w:sz w:val="24"/>
           <w:u w:val="none"/>
@@ -540,7 +540,7 @@
       </w:r>
       <w:r>
         <w:rPr>
-          <w:rFonts w:ascii="Times New Roman" w:hAnsi="Times New Roman" w:cs="Times New Roman" w:eastAsia="Times New Roman"/>
+          <w:rFonts w:ascii="Arial" w:hAnsi="Arial" w:cs="Arial" w:eastAsia="Arial"/>
           <w:b w:val="0"/>
           <w:sz w:val="24"/>
           <w:u w:val="none"/>
@@ -554,7 +554,7 @@
       </w:pPr>
       <w:r>
         <w:rPr>
-          <w:rFonts w:ascii="Times New Roman" w:hAnsi="Times New Roman" w:cs="Times New Roman" w:eastAsia="Times New Roman"/>
+          <w:rFonts w:ascii="Arial" w:hAnsi="Arial" w:cs="Arial" w:eastAsia="Arial"/>
           <w:b/>
           <w:sz w:val="24"/>
           <w:u w:val="none"/>
@@ -563,7 +563,7 @@
       </w:r>
       <w:r>
         <w:rPr>
-          <w:rFonts w:ascii="Times New Roman" w:hAnsi="Times New Roman" w:cs="Times New Roman" w:eastAsia="Times New Roman"/>
+          <w:rFonts w:ascii="Arial" w:hAnsi="Arial" w:cs="Arial" w:eastAsia="Arial"/>
           <w:b w:val="0"/>
           <w:sz w:val="24"/>
           <w:u w:val="none"/>
@@ -577,7 +577,7 @@
       </w:pPr>
       <w:r>
         <w:rPr>
-          <w:rFonts w:ascii="Times New Roman" w:hAnsi="Times New Roman" w:cs="Times New Roman" w:eastAsia="Times New Roman"/>
+          <w:rFonts w:ascii="Arial" w:hAnsi="Arial" w:cs="Arial" w:eastAsia="Arial"/>
           <w:b/>
           <w:sz w:val="24"/>
           <w:u w:val="none"/>
@@ -586,7 +586,7 @@
       </w:r>
       <w:r>
         <w:rPr>
-          <w:rFonts w:ascii="Times New Roman" w:hAnsi="Times New Roman" w:cs="Times New Roman" w:eastAsia="Times New Roman"/>
+          <w:rFonts w:ascii="Arial" w:hAnsi="Arial" w:cs="Arial" w:eastAsia="Arial"/>
           <w:b w:val="0"/>
           <w:sz w:val="24"/>
           <w:u w:val="none"/>
@@ -600,7 +600,7 @@
       </w:pPr>
       <w:r>
         <w:rPr>
-          <w:rFonts w:ascii="Times New Roman" w:hAnsi="Times New Roman" w:cs="Times New Roman" w:eastAsia="Times New Roman"/>
+          <w:rFonts w:ascii="Arial" w:hAnsi="Arial" w:cs="Arial" w:eastAsia="Arial"/>
           <w:b/>
           <w:sz w:val="24"/>
           <w:u w:val="none"/>
@@ -609,7 +609,7 @@
       </w:r>
       <w:r>
         <w:rPr>
-          <w:rFonts w:ascii="Times New Roman" w:hAnsi="Times New Roman" w:cs="Times New Roman" w:eastAsia="Times New Roman"/>
+          <w:rFonts w:ascii="Arial" w:hAnsi="Arial" w:cs="Arial" w:eastAsia="Arial"/>
           <w:b w:val="0"/>
           <w:sz w:val="24"/>
           <w:u w:val="none"/>
@@ -623,7 +623,7 @@
       </w:pPr>
       <w:r>
         <w:rPr>
-          <w:rFonts w:ascii="Times New Roman" w:hAnsi="Times New Roman" w:cs="Times New Roman" w:eastAsia="Times New Roman"/>
+          <w:rFonts w:ascii="Arial" w:hAnsi="Arial" w:cs="Arial" w:eastAsia="Arial"/>
           <w:b/>
           <w:sz w:val="24"/>
           <w:u w:val="none"/>
@@ -632,7 +632,7 @@
       </w:r>
       <w:r>
         <w:rPr>
-          <w:rFonts w:ascii="Times New Roman" w:hAnsi="Times New Roman" w:cs="Times New Roman" w:eastAsia="Times New Roman"/>
+          <w:rFonts w:ascii="Arial" w:hAnsi="Arial" w:cs="Arial" w:eastAsia="Arial"/>
           <w:b w:val="0"/>
           <w:sz w:val="24"/>
           <w:u w:val="none"/>
@@ -646,7 +646,7 @@
       </w:pPr>
       <w:r>
         <w:rPr>
-          <w:rFonts w:ascii="Times New Roman" w:hAnsi="Times New Roman" w:cs="Times New Roman" w:eastAsia="Times New Roman"/>
+          <w:rFonts w:ascii="Arial" w:hAnsi="Arial" w:cs="Arial" w:eastAsia="Arial"/>
           <w:b/>
           <w:sz w:val="24"/>
           <w:u w:val="none"/>
@@ -655,7 +655,7 @@
       </w:r>
       <w:r>
         <w:rPr>
-          <w:rFonts w:ascii="Times New Roman" w:hAnsi="Times New Roman" w:cs="Times New Roman" w:eastAsia="Times New Roman"/>
+          <w:rFonts w:ascii="Arial" w:hAnsi="Arial" w:cs="Arial" w:eastAsia="Arial"/>
           <w:b w:val="0"/>
           <w:sz w:val="24"/>
           <w:u w:val="none"/>
@@ -669,7 +669,7 @@
       </w:pPr>
       <w:r>
         <w:rPr>
-          <w:rFonts w:ascii="Times New Roman" w:hAnsi="Times New Roman" w:cs="Times New Roman" w:eastAsia="Times New Roman"/>
+          <w:rFonts w:ascii="Arial" w:hAnsi="Arial" w:cs="Arial" w:eastAsia="Arial"/>
           <w:b/>
           <w:sz w:val="24"/>
           <w:u w:val="none"/>
@@ -678,7 +678,7 @@
       </w:r>
       <w:r>
         <w:rPr>
-          <w:rFonts w:ascii="Times New Roman" w:hAnsi="Times New Roman" w:cs="Times New Roman" w:eastAsia="Times New Roman"/>
+          <w:rFonts w:ascii="Arial" w:hAnsi="Arial" w:cs="Arial" w:eastAsia="Arial"/>
           <w:b w:val="0"/>
           <w:sz w:val="24"/>
           <w:u w:val="none"/>
@@ -692,7 +692,7 @@
       </w:pPr>
       <w:r>
         <w:rPr>
-          <w:rFonts w:ascii="Times New Roman" w:hAnsi="Times New Roman" w:cs="Times New Roman" w:eastAsia="Times New Roman"/>
+          <w:rFonts w:ascii="Arial" w:hAnsi="Arial" w:cs="Arial" w:eastAsia="Arial"/>
           <w:b/>
           <w:sz w:val="24"/>
           <w:u w:val="none"/>
@@ -706,7 +706,7 @@
       </w:pPr>
       <w:r>
         <w:rPr>
-          <w:rFonts w:ascii="Times New Roman" w:hAnsi="Times New Roman" w:cs="Times New Roman" w:eastAsia="Times New Roman"/>
+          <w:rFonts w:ascii="Arial" w:hAnsi="Arial" w:cs="Arial" w:eastAsia="Arial"/>
           <w:b/>
           <w:sz w:val="24"/>
           <w:u w:val="none"/>
@@ -715,7 +715,7 @@
       </w:r>
       <w:r>
         <w:rPr>
-          <w:rFonts w:ascii="Times New Roman" w:hAnsi="Times New Roman" w:cs="Times New Roman" w:eastAsia="Times New Roman"/>
+          <w:rFonts w:ascii="Arial" w:hAnsi="Arial" w:cs="Arial" w:eastAsia="Arial"/>
           <w:b w:val="0"/>
           <w:sz w:val="24"/>
           <w:u w:val="none"/>
@@ -729,7 +729,7 @@
       </w:pPr>
       <w:r>
         <w:rPr>
-          <w:rFonts w:ascii="Times New Roman" w:hAnsi="Times New Roman" w:cs="Times New Roman" w:eastAsia="Times New Roman"/>
+          <w:rFonts w:ascii="Arial" w:hAnsi="Arial" w:cs="Arial" w:eastAsia="Arial"/>
           <w:b/>
           <w:sz w:val="24"/>
           <w:u w:val="none"/>
@@ -738,7 +738,7 @@
       </w:r>
       <w:r>
         <w:rPr>
-          <w:rFonts w:ascii="Times New Roman" w:hAnsi="Times New Roman" w:cs="Times New Roman" w:eastAsia="Times New Roman"/>
+          <w:rFonts w:ascii="Arial" w:hAnsi="Arial" w:cs="Arial" w:eastAsia="Arial"/>
           <w:b w:val="0"/>
           <w:sz w:val="24"/>
           <w:u w:val="none"/>
@@ -752,7 +752,7 @@
       </w:pPr>
       <w:r>
         <w:rPr>
-          <w:rFonts w:ascii="Times New Roman" w:hAnsi="Times New Roman" w:cs="Times New Roman" w:eastAsia="Times New Roman"/>
+          <w:rFonts w:ascii="Arial" w:hAnsi="Arial" w:cs="Arial" w:eastAsia="Arial"/>
           <w:b/>
           <w:sz w:val="24"/>
           <w:u w:val="none"/>
@@ -761,7 +761,7 @@
       </w:r>
       <w:r>
         <w:rPr>
-          <w:rFonts w:ascii="Times New Roman" w:hAnsi="Times New Roman" w:cs="Times New Roman" w:eastAsia="Times New Roman"/>
+          <w:rFonts w:ascii="Arial" w:hAnsi="Arial" w:cs="Arial" w:eastAsia="Arial"/>
           <w:b w:val="0"/>
           <w:sz w:val="24"/>
           <w:u w:val="none"/>
@@ -775,7 +775,7 @@
       </w:pPr>
       <w:r>
         <w:rPr>
-          <w:rFonts w:ascii="Times New Roman" w:hAnsi="Times New Roman" w:cs="Times New Roman" w:eastAsia="Times New Roman"/>
+          <w:rFonts w:ascii="Arial" w:hAnsi="Arial" w:cs="Arial" w:eastAsia="Arial"/>
           <w:b/>
           <w:sz w:val="24"/>
           <w:u w:val="none"/>
@@ -784,7 +784,7 @@
       </w:r>
       <w:r>
         <w:rPr>
-          <w:rFonts w:ascii="Times New Roman" w:hAnsi="Times New Roman" w:cs="Times New Roman" w:eastAsia="Times New Roman"/>
+          <w:rFonts w:ascii="Arial" w:hAnsi="Arial" w:cs="Arial" w:eastAsia="Arial"/>
           <w:b w:val="0"/>
           <w:sz w:val="24"/>
           <w:u w:val="none"/>
@@ -798,7 +798,7 @@
       </w:pPr>
       <w:r>
         <w:rPr>
-          <w:rFonts w:ascii="Times New Roman" w:hAnsi="Times New Roman" w:cs="Times New Roman" w:eastAsia="Times New Roman"/>
+          <w:rFonts w:ascii="Arial" w:hAnsi="Arial" w:cs="Arial" w:eastAsia="Arial"/>
           <w:b/>
           <w:sz w:val="24"/>
           <w:u w:val="none"/>
@@ -807,7 +807,7 @@
       </w:r>
       <w:r>
         <w:rPr>
-          <w:rFonts w:ascii="Times New Roman" w:hAnsi="Times New Roman" w:cs="Times New Roman" w:eastAsia="Times New Roman"/>
+          <w:rFonts w:ascii="Arial" w:hAnsi="Arial" w:cs="Arial" w:eastAsia="Arial"/>
           <w:b w:val="0"/>
           <w:sz w:val="24"/>
           <w:u w:val="none"/>
@@ -821,7 +821,7 @@
       </w:pPr>
       <w:r>
         <w:rPr>
-          <w:rFonts w:ascii="Times New Roman" w:hAnsi="Times New Roman" w:cs="Times New Roman" w:eastAsia="Times New Roman"/>
+          <w:rFonts w:ascii="Arial" w:hAnsi="Arial" w:cs="Arial" w:eastAsia="Arial"/>
           <w:b/>
           <w:sz w:val="24"/>
           <w:u w:val="none"/>
@@ -830,7 +830,7 @@
       </w:r>
       <w:r>
         <w:rPr>
-          <w:rFonts w:ascii="Times New Roman" w:hAnsi="Times New Roman" w:cs="Times New Roman" w:eastAsia="Times New Roman"/>
+          <w:rFonts w:ascii="Arial" w:hAnsi="Arial" w:cs="Arial" w:eastAsia="Arial"/>
           <w:b w:val="0"/>
           <w:sz w:val="24"/>
           <w:u w:val="none"/>
@@ -844,7 +844,7 @@
       </w:pPr>
       <w:r>
         <w:rPr>
-          <w:rFonts w:ascii="Times New Roman" w:hAnsi="Times New Roman" w:cs="Times New Roman" w:eastAsia="Times New Roman"/>
+          <w:rFonts w:ascii="Arial" w:hAnsi="Arial" w:cs="Arial" w:eastAsia="Arial"/>
           <w:b/>
           <w:sz w:val="24"/>
           <w:u w:val="none"/>
@@ -853,7 +853,7 @@
       </w:r>
       <w:r>
         <w:rPr>
-          <w:rFonts w:ascii="Times New Roman" w:hAnsi="Times New Roman" w:cs="Times New Roman" w:eastAsia="Times New Roman"/>
+          <w:rFonts w:ascii="Arial" w:hAnsi="Arial" w:cs="Arial" w:eastAsia="Arial"/>
           <w:b w:val="0"/>
           <w:sz w:val="24"/>
           <w:u w:val="none"/>
@@ -867,7 +867,7 @@
       </w:pPr>
       <w:r>
         <w:rPr>
-          <w:rFonts w:ascii="Times New Roman" w:hAnsi="Times New Roman" w:cs="Times New Roman" w:eastAsia="Times New Roman"/>
+          <w:rFonts w:ascii="Arial" w:hAnsi="Arial" w:cs="Arial" w:eastAsia="Arial"/>
           <w:b/>
           <w:sz w:val="24"/>
           <w:u w:val="none"/>
@@ -876,7 +876,7 @@
       </w:r>
       <w:r>
         <w:rPr>
-          <w:rFonts w:ascii="Times New Roman" w:hAnsi="Times New Roman" w:cs="Times New Roman" w:eastAsia="Times New Roman"/>
+          <w:rFonts w:ascii="Arial" w:hAnsi="Arial" w:cs="Arial" w:eastAsia="Arial"/>
           <w:b w:val="0"/>
           <w:sz w:val="24"/>
           <w:u w:val="none"/>
@@ -890,7 +890,7 @@
       </w:pPr>
       <w:r>
         <w:rPr>
-          <w:rFonts w:ascii="Times New Roman" w:hAnsi="Times New Roman" w:cs="Times New Roman" w:eastAsia="Times New Roman"/>
+          <w:rFonts w:ascii="Arial" w:hAnsi="Arial" w:cs="Arial" w:eastAsia="Arial"/>
           <w:b/>
           <w:sz w:val="24"/>
           <w:u w:val="none"/>
@@ -899,7 +899,7 @@
       </w:r>
       <w:r>
         <w:rPr>
-          <w:rFonts w:ascii="Times New Roman" w:hAnsi="Times New Roman" w:cs="Times New Roman" w:eastAsia="Times New Roman"/>
+          <w:rFonts w:ascii="Arial" w:hAnsi="Arial" w:cs="Arial" w:eastAsia="Arial"/>
           <w:b w:val="0"/>
           <w:sz w:val="24"/>
           <w:u w:val="none"/>
@@ -913,7 +913,7 @@
       </w:pPr>
       <w:r>
         <w:rPr>
-          <w:rFonts w:ascii="Times New Roman" w:hAnsi="Times New Roman" w:cs="Times New Roman" w:eastAsia="Times New Roman"/>
+          <w:rFonts w:ascii="Arial" w:hAnsi="Arial" w:cs="Arial" w:eastAsia="Arial"/>
           <w:b/>
           <w:sz w:val="24"/>
           <w:u w:val="none"/>
@@ -922,7 +922,7 @@
       </w:r>
       <w:r>
         <w:rPr>
-          <w:rFonts w:ascii="Times New Roman" w:hAnsi="Times New Roman" w:cs="Times New Roman" w:eastAsia="Times New Roman"/>
+          <w:rFonts w:ascii="Arial" w:hAnsi="Arial" w:cs="Arial" w:eastAsia="Arial"/>
           <w:b w:val="0"/>
           <w:sz w:val="24"/>
           <w:u w:val="none"/>
@@ -936,7 +936,7 @@
       </w:pPr>
       <w:r>
         <w:rPr>
-          <w:rFonts w:ascii="Times New Roman" w:hAnsi="Times New Roman" w:cs="Times New Roman" w:eastAsia="Times New Roman"/>
+          <w:rFonts w:ascii="Arial" w:hAnsi="Arial" w:cs="Arial" w:eastAsia="Arial"/>
           <w:b/>
           <w:sz w:val="24"/>
           <w:u w:val="none"/>
@@ -945,7 +945,7 @@
       </w:r>
       <w:r>
         <w:rPr>
-          <w:rFonts w:ascii="Times New Roman" w:hAnsi="Times New Roman" w:cs="Times New Roman" w:eastAsia="Times New Roman"/>
+          <w:rFonts w:ascii="Arial" w:hAnsi="Arial" w:cs="Arial" w:eastAsia="Arial"/>
           <w:b w:val="0"/>
           <w:sz w:val="24"/>
           <w:u w:val="none"/>
@@ -959,7 +959,7 @@
       </w:pPr>
       <w:r>
         <w:rPr>
-          <w:rFonts w:ascii="Times New Roman" w:hAnsi="Times New Roman" w:cs="Times New Roman" w:eastAsia="Times New Roman"/>
+          <w:rFonts w:ascii="Arial" w:hAnsi="Arial" w:cs="Arial" w:eastAsia="Arial"/>
           <w:b/>
           <w:sz w:val="24"/>
           <w:u w:val="none"/>
@@ -968,7 +968,7 @@
       </w:r>
       <w:r>
         <w:rPr>
-          <w:rFonts w:ascii="Times New Roman" w:hAnsi="Times New Roman" w:cs="Times New Roman" w:eastAsia="Times New Roman"/>
+          <w:rFonts w:ascii="Arial" w:hAnsi="Arial" w:cs="Arial" w:eastAsia="Arial"/>
           <w:b w:val="0"/>
           <w:sz w:val="24"/>
           <w:u w:val="none"/>
@@ -982,7 +982,7 @@
       </w:pPr>
       <w:r>
         <w:rPr>
-          <w:rFonts w:ascii="Times New Roman" w:hAnsi="Times New Roman" w:cs="Times New Roman" w:eastAsia="Times New Roman"/>
+          <w:rFonts w:ascii="Arial" w:hAnsi="Arial" w:cs="Arial" w:eastAsia="Arial"/>
           <w:b/>
           <w:sz w:val="24"/>
           <w:u w:val="none"/>
@@ -991,7 +991,7 @@
       </w:r>
       <w:r>
         <w:rPr>
-          <w:rFonts w:ascii="Times New Roman" w:hAnsi="Times New Roman" w:cs="Times New Roman" w:eastAsia="Times New Roman"/>
+          <w:rFonts w:ascii="Arial" w:hAnsi="Arial" w:cs="Arial" w:eastAsia="Arial"/>
           <w:b w:val="0"/>
           <w:sz w:val="24"/>
           <w:u w:val="none"/>
@@ -1005,7 +1005,7 @@
       </w:pPr>
       <w:r>
         <w:rPr>
-          <w:rFonts w:ascii="Times New Roman" w:hAnsi="Times New Roman" w:cs="Times New Roman" w:eastAsia="Times New Roman"/>
+          <w:rFonts w:ascii="Arial" w:hAnsi="Arial" w:cs="Arial" w:eastAsia="Arial"/>
           <w:b/>
           <w:sz w:val="24"/>
           <w:u w:val="none"/>
@@ -1014,7 +1014,7 @@
       </w:r>
       <w:r>
         <w:rPr>
-          <w:rFonts w:ascii="Times New Roman" w:hAnsi="Times New Roman" w:cs="Times New Roman" w:eastAsia="Times New Roman"/>
+          <w:rFonts w:ascii="Arial" w:hAnsi="Arial" w:cs="Arial" w:eastAsia="Arial"/>
           <w:b w:val="0"/>
           <w:sz w:val="24"/>
           <w:u w:val="none"/>
@@ -1028,7 +1028,7 @@
       </w:pPr>
       <w:r>
         <w:rPr>
-          <w:rFonts w:ascii="Times New Roman" w:hAnsi="Times New Roman" w:cs="Times New Roman" w:eastAsia="Times New Roman"/>
+          <w:rFonts w:ascii="Arial" w:hAnsi="Arial" w:cs="Arial" w:eastAsia="Arial"/>
           <w:b/>
           <w:sz w:val="24"/>
           <w:u w:val="none"/>
@@ -1037,7 +1037,7 @@
       </w:r>
       <w:r>
         <w:rPr>
-          <w:rFonts w:ascii="Times New Roman" w:hAnsi="Times New Roman" w:cs="Times New Roman" w:eastAsia="Times New Roman"/>
+          <w:rFonts w:ascii="Arial" w:hAnsi="Arial" w:cs="Arial" w:eastAsia="Arial"/>
           <w:b w:val="0"/>
           <w:sz w:val="24"/>
           <w:u w:val="none"/>
@@ -1051,7 +1051,7 @@
       </w:pPr>
       <w:r>
         <w:rPr>
-          <w:rFonts w:ascii="Times New Roman" w:hAnsi="Times New Roman" w:cs="Times New Roman" w:eastAsia="Times New Roman"/>
+          <w:rFonts w:ascii="Arial" w:hAnsi="Arial" w:cs="Arial" w:eastAsia="Arial"/>
           <w:b/>
           <w:sz w:val="24"/>
           <w:u w:val="none"/>
@@ -1060,7 +1060,7 @@
       </w:r>
       <w:r>
         <w:rPr>
-          <w:rFonts w:ascii="Times New Roman" w:hAnsi="Times New Roman" w:cs="Times New Roman" w:eastAsia="Times New Roman"/>
+          <w:rFonts w:ascii="Arial" w:hAnsi="Arial" w:cs="Arial" w:eastAsia="Arial"/>
           <w:b w:val="0"/>
           <w:sz w:val="24"/>
           <w:u w:val="none"/>
@@ -1074,7 +1074,7 @@
       </w:pPr>
       <w:r>
         <w:rPr>
-          <w:rFonts w:ascii="Times New Roman" w:hAnsi="Times New Roman" w:cs="Times New Roman" w:eastAsia="Times New Roman"/>
+          <w:rFonts w:ascii="Arial" w:hAnsi="Arial" w:cs="Arial" w:eastAsia="Arial"/>
           <w:b/>
           <w:sz w:val="24"/>
           <w:u w:val="none"/>
@@ -1083,7 +1083,7 @@
       </w:r>
       <w:r>
         <w:rPr>
-          <w:rFonts w:ascii="Times New Roman" w:hAnsi="Times New Roman" w:cs="Times New Roman" w:eastAsia="Times New Roman"/>
+          <w:rFonts w:ascii="Arial" w:hAnsi="Arial" w:cs="Arial" w:eastAsia="Arial"/>
           <w:b w:val="0"/>
           <w:sz w:val="24"/>
           <w:u w:val="none"/>
@@ -1097,7 +1097,7 @@
       </w:pPr>
       <w:r>
         <w:rPr>
-          <w:rFonts w:ascii="Times New Roman" w:hAnsi="Times New Roman" w:cs="Times New Roman" w:eastAsia="Times New Roman"/>
+          <w:rFonts w:ascii="Arial" w:hAnsi="Arial" w:cs="Arial" w:eastAsia="Arial"/>
           <w:b/>
           <w:sz w:val="24"/>
           <w:u w:val="none"/>
@@ -1106,7 +1106,7 @@
       </w:r>
       <w:r>
         <w:rPr>
-          <w:rFonts w:ascii="Times New Roman" w:hAnsi="Times New Roman" w:cs="Times New Roman" w:eastAsia="Times New Roman"/>
+          <w:rFonts w:ascii="Arial" w:hAnsi="Arial" w:cs="Arial" w:eastAsia="Arial"/>
           <w:b w:val="0"/>
           <w:sz w:val="24"/>
           <w:u w:val="none"/>
@@ -1120,7 +1120,7 @@
       </w:pPr>
       <w:r>
         <w:rPr>
-          <w:rFonts w:ascii="Times New Roman" w:hAnsi="Times New Roman" w:cs="Times New Roman" w:eastAsia="Times New Roman"/>
+          <w:rFonts w:ascii="Arial" w:hAnsi="Arial" w:cs="Arial" w:eastAsia="Arial"/>
           <w:b/>
           <w:sz w:val="24"/>
           <w:u w:val="none"/>
@@ -1129,7 +1129,7 @@
       </w:r>
       <w:r>
         <w:rPr>
-          <w:rFonts w:ascii="Times New Roman" w:hAnsi="Times New Roman" w:cs="Times New Roman" w:eastAsia="Times New Roman"/>
+          <w:rFonts w:ascii="Arial" w:hAnsi="Arial" w:cs="Arial" w:eastAsia="Arial"/>
           <w:b w:val="0"/>
           <w:sz w:val="24"/>
           <w:u w:val="none"/>
@@ -1143,7 +1143,7 @@
       </w:pPr>
       <w:r>
         <w:rPr>
-          <w:rFonts w:ascii="Times New Roman" w:hAnsi="Times New Roman" w:cs="Times New Roman" w:eastAsia="Times New Roman"/>
+          <w:rFonts w:ascii="Arial" w:hAnsi="Arial" w:cs="Arial" w:eastAsia="Arial"/>
           <w:b/>
           <w:sz w:val="24"/>
           <w:u w:val="none"/>
@@ -1152,7 +1152,7 @@
       </w:r>
       <w:r>
         <w:rPr>
-          <w:rFonts w:ascii="Times New Roman" w:hAnsi="Times New Roman" w:cs="Times New Roman" w:eastAsia="Times New Roman"/>
+          <w:rFonts w:ascii="Arial" w:hAnsi="Arial" w:cs="Arial" w:eastAsia="Arial"/>
           <w:b w:val="0"/>
           <w:sz w:val="24"/>
           <w:u w:val="none"/>
@@ -1166,7 +1166,7 @@
       </w:pPr>
       <w:r>
         <w:rPr>
-          <w:rFonts w:ascii="Times New Roman" w:hAnsi="Times New Roman" w:cs="Times New Roman" w:eastAsia="Times New Roman"/>
+          <w:rFonts w:ascii="Arial" w:hAnsi="Arial" w:cs="Arial" w:eastAsia="Arial"/>
           <w:b/>
           <w:sz w:val="24"/>
           <w:u w:val="none"/>
@@ -1175,7 +1175,7 @@
       </w:r>
       <w:r>
         <w:rPr>
-          <w:rFonts w:ascii="Times New Roman" w:hAnsi="Times New Roman" w:cs="Times New Roman" w:eastAsia="Times New Roman"/>
+          <w:rFonts w:ascii="Arial" w:hAnsi="Arial" w:cs="Arial" w:eastAsia="Arial"/>
           <w:b w:val="0"/>
           <w:sz w:val="24"/>
           <w:u w:val="none"/>
@@ -1189,7 +1189,7 @@
       </w:pPr>
       <w:r>
         <w:rPr>
-          <w:rFonts w:ascii="Times New Roman" w:hAnsi="Times New Roman" w:cs="Times New Roman" w:eastAsia="Times New Roman"/>
+          <w:rFonts w:ascii="Arial" w:hAnsi="Arial" w:cs="Arial" w:eastAsia="Arial"/>
           <w:b/>
           <w:sz w:val="24"/>
           <w:u w:val="none"/>
@@ -1225,7 +1225,7 @@
             </w:pPr>
             <w:r>
               <w:rPr>
-                <w:rFonts w:ascii="Times New Roman" w:hAnsi="Times New Roman" w:cs="Times New Roman" w:eastAsia="Times New Roman"/>
+                <w:rFonts w:ascii="Arial" w:hAnsi="Arial" w:cs="Arial" w:eastAsia="Arial"/>
                 <w:b/>
                 <w:sz w:val="24"/>
                 <w:u w:val="none"/>
@@ -1246,7 +1246,7 @@
             </w:pPr>
             <w:r>
               <w:rPr>
-                <w:rFonts w:ascii="Times New Roman" w:hAnsi="Times New Roman" w:cs="Times New Roman" w:eastAsia="Times New Roman"/>
+                <w:rFonts w:ascii="Arial" w:hAnsi="Arial" w:cs="Arial" w:eastAsia="Arial"/>
                 <w:b/>
                 <w:sz w:val="24"/>
                 <w:u w:val="none"/>
@@ -1267,7 +1267,7 @@
             </w:pPr>
             <w:r>
               <w:rPr>
-                <w:rFonts w:ascii="Times New Roman" w:hAnsi="Times New Roman" w:cs="Times New Roman" w:eastAsia="Times New Roman"/>
+                <w:rFonts w:ascii="Arial" w:hAnsi="Arial" w:cs="Arial" w:eastAsia="Arial"/>
                 <w:b/>
                 <w:sz w:val="24"/>
                 <w:u w:val="none"/>
@@ -1289,7 +1289,7 @@
             </w:pPr>
             <w:r>
               <w:rPr>
-                <w:rFonts w:ascii="Times New Roman" w:hAnsi="Times New Roman" w:cs="Times New Roman" w:eastAsia="Times New Roman"/>
+                <w:rFonts w:ascii="Arial" w:hAnsi="Arial" w:cs="Arial" w:eastAsia="Arial"/>
                 <w:b w:val="0"/>
                 <w:sz w:val="24"/>
                 <w:u w:val="none"/>
@@ -1309,7 +1309,7 @@
             </w:pPr>
             <w:r>
               <w:rPr>
-                <w:rFonts w:ascii="Times New Roman" w:hAnsi="Times New Roman" w:cs="Times New Roman" w:eastAsia="Times New Roman"/>
+                <w:rFonts w:ascii="Arial" w:hAnsi="Arial" w:cs="Arial" w:eastAsia="Arial"/>
                 <w:b w:val="0"/>
                 <w:sz w:val="24"/>
                 <w:u w:val="none"/>
@@ -1329,7 +1329,7 @@
             </w:pPr>
             <w:r>
               <w:rPr>
-                <w:rFonts w:ascii="Times New Roman" w:hAnsi="Times New Roman" w:cs="Times New Roman" w:eastAsia="Times New Roman"/>
+                <w:rFonts w:ascii="Arial" w:hAnsi="Arial" w:cs="Arial" w:eastAsia="Arial"/>
                 <w:b w:val="0"/>
                 <w:sz w:val="24"/>
                 <w:u w:val="none"/>
@@ -1351,7 +1351,7 @@
             </w:pPr>
             <w:r>
               <w:rPr>
-                <w:rFonts w:ascii="Times New Roman" w:hAnsi="Times New Roman" w:cs="Times New Roman" w:eastAsia="Times New Roman"/>
+                <w:rFonts w:ascii="Arial" w:hAnsi="Arial" w:cs="Arial" w:eastAsia="Arial"/>
                 <w:b w:val="0"/>
                 <w:sz w:val="24"/>
                 <w:u w:val="none"/>
@@ -1371,7 +1371,7 @@
             </w:pPr>
             <w:r>
               <w:rPr>
-                <w:rFonts w:ascii="Times New Roman" w:hAnsi="Times New Roman" w:cs="Times New Roman" w:eastAsia="Times New Roman"/>
+                <w:rFonts w:ascii="Arial" w:hAnsi="Arial" w:cs="Arial" w:eastAsia="Arial"/>
                 <w:b w:val="0"/>
                 <w:sz w:val="24"/>
                 <w:u w:val="none"/>
@@ -1391,7 +1391,7 @@
             </w:pPr>
             <w:r>
               <w:rPr>
-                <w:rFonts w:ascii="Times New Roman" w:hAnsi="Times New Roman" w:cs="Times New Roman" w:eastAsia="Times New Roman"/>
+                <w:rFonts w:ascii="Arial" w:hAnsi="Arial" w:cs="Arial" w:eastAsia="Arial"/>
                 <w:b w:val="0"/>
                 <w:sz w:val="24"/>
                 <w:u w:val="none"/>
@@ -1413,7 +1413,7 @@
             </w:pPr>
             <w:r>
               <w:rPr>
-                <w:rFonts w:ascii="Times New Roman" w:hAnsi="Times New Roman" w:cs="Times New Roman" w:eastAsia="Times New Roman"/>
+                <w:rFonts w:ascii="Arial" w:hAnsi="Arial" w:cs="Arial" w:eastAsia="Arial"/>
                 <w:b w:val="0"/>
                 <w:sz w:val="24"/>
                 <w:u w:val="none"/>
@@ -1433,7 +1433,7 @@
             </w:pPr>
             <w:r>
               <w:rPr>
-                <w:rFonts w:ascii="Times New Roman" w:hAnsi="Times New Roman" w:cs="Times New Roman" w:eastAsia="Times New Roman"/>
+                <w:rFonts w:ascii="Arial" w:hAnsi="Arial" w:cs="Arial" w:eastAsia="Arial"/>
                 <w:b w:val="0"/>
                 <w:sz w:val="24"/>
                 <w:u w:val="none"/>
@@ -1453,7 +1453,7 @@
             </w:pPr>
             <w:r>
               <w:rPr>
-                <w:rFonts w:ascii="Times New Roman" w:hAnsi="Times New Roman" w:cs="Times New Roman" w:eastAsia="Times New Roman"/>
+                <w:rFonts w:ascii="Arial" w:hAnsi="Arial" w:cs="Arial" w:eastAsia="Arial"/>
                 <w:b w:val="0"/>
                 <w:sz w:val="24"/>
                 <w:u w:val="none"/>
@@ -1475,7 +1475,7 @@
             </w:pPr>
             <w:r>
               <w:rPr>
-                <w:rFonts w:ascii="Times New Roman" w:hAnsi="Times New Roman" w:cs="Times New Roman" w:eastAsia="Times New Roman"/>
+                <w:rFonts w:ascii="Arial" w:hAnsi="Arial" w:cs="Arial" w:eastAsia="Arial"/>
                 <w:b w:val="0"/>
                 <w:sz w:val="24"/>
                 <w:u w:val="none"/>
@@ -1495,7 +1495,7 @@
             </w:pPr>
             <w:r>
               <w:rPr>
-                <w:rFonts w:ascii="Times New Roman" w:hAnsi="Times New Roman" w:cs="Times New Roman" w:eastAsia="Times New Roman"/>
+                <w:rFonts w:ascii="Arial" w:hAnsi="Arial" w:cs="Arial" w:eastAsia="Arial"/>
                 <w:b w:val="0"/>
                 <w:sz w:val="24"/>
                 <w:u w:val="none"/>
@@ -1515,7 +1515,7 @@
             </w:pPr>
             <w:r>
               <w:rPr>
-                <w:rFonts w:ascii="Times New Roman" w:hAnsi="Times New Roman" w:cs="Times New Roman" w:eastAsia="Times New Roman"/>
+                <w:rFonts w:ascii="Arial" w:hAnsi="Arial" w:cs="Arial" w:eastAsia="Arial"/>
                 <w:b w:val="0"/>
                 <w:sz w:val="24"/>
                 <w:u w:val="none"/>
@@ -1537,7 +1537,7 @@
             </w:pPr>
             <w:r>
               <w:rPr>
-                <w:rFonts w:ascii="Times New Roman" w:hAnsi="Times New Roman" w:cs="Times New Roman" w:eastAsia="Times New Roman"/>
+                <w:rFonts w:ascii="Arial" w:hAnsi="Arial" w:cs="Arial" w:eastAsia="Arial"/>
                 <w:b w:val="0"/>
                 <w:sz w:val="24"/>
                 <w:u w:val="none"/>
@@ -1557,7 +1557,7 @@
             </w:pPr>
             <w:r>
               <w:rPr>
-                <w:rFonts w:ascii="Times New Roman" w:hAnsi="Times New Roman" w:cs="Times New Roman" w:eastAsia="Times New Roman"/>
+                <w:rFonts w:ascii="Arial" w:hAnsi="Arial" w:cs="Arial" w:eastAsia="Arial"/>
                 <w:b w:val="0"/>
                 <w:sz w:val="24"/>
                 <w:u w:val="none"/>
@@ -1577,7 +1577,7 @@
             </w:pPr>
             <w:r>
               <w:rPr>
-                <w:rFonts w:ascii="Times New Roman" w:hAnsi="Times New Roman" w:cs="Times New Roman" w:eastAsia="Times New Roman"/>
+                <w:rFonts w:ascii="Arial" w:hAnsi="Arial" w:cs="Arial" w:eastAsia="Arial"/>
                 <w:b w:val="0"/>
                 <w:sz w:val="24"/>
                 <w:u w:val="none"/>
@@ -1599,7 +1599,7 @@
             </w:pPr>
             <w:r>
               <w:rPr>
-                <w:rFonts w:ascii="Times New Roman" w:hAnsi="Times New Roman" w:cs="Times New Roman" w:eastAsia="Times New Roman"/>
+                <w:rFonts w:ascii="Arial" w:hAnsi="Arial" w:cs="Arial" w:eastAsia="Arial"/>
                 <w:b w:val="0"/>
                 <w:sz w:val="24"/>
                 <w:u w:val="none"/>
@@ -1619,7 +1619,7 @@
             </w:pPr>
             <w:r>
               <w:rPr>
-                <w:rFonts w:ascii="Times New Roman" w:hAnsi="Times New Roman" w:cs="Times New Roman" w:eastAsia="Times New Roman"/>
+                <w:rFonts w:ascii="Arial" w:hAnsi="Arial" w:cs="Arial" w:eastAsia="Arial"/>
                 <w:b w:val="0"/>
                 <w:sz w:val="24"/>
                 <w:u w:val="none"/>
@@ -1639,7 +1639,7 @@
             </w:pPr>
             <w:r>
               <w:rPr>
-                <w:rFonts w:ascii="Times New Roman" w:hAnsi="Times New Roman" w:cs="Times New Roman" w:eastAsia="Times New Roman"/>
+                <w:rFonts w:ascii="Arial" w:hAnsi="Arial" w:cs="Arial" w:eastAsia="Arial"/>
                 <w:b w:val="0"/>
                 <w:sz w:val="24"/>
                 <w:u w:val="none"/>
@@ -1661,7 +1661,7 @@
             </w:pPr>
             <w:r>
               <w:rPr>
-                <w:rFonts w:ascii="Times New Roman" w:hAnsi="Times New Roman" w:cs="Times New Roman" w:eastAsia="Times New Roman"/>
+                <w:rFonts w:ascii="Arial" w:hAnsi="Arial" w:cs="Arial" w:eastAsia="Arial"/>
                 <w:b w:val="0"/>
                 <w:sz w:val="24"/>
                 <w:u w:val="none"/>
@@ -1681,7 +1681,7 @@
             </w:pPr>
             <w:r>
               <w:rPr>
-                <w:rFonts w:ascii="Times New Roman" w:hAnsi="Times New Roman" w:cs="Times New Roman" w:eastAsia="Times New Roman"/>
+                <w:rFonts w:ascii="Arial" w:hAnsi="Arial" w:cs="Arial" w:eastAsia="Arial"/>
                 <w:b w:val="0"/>
                 <w:sz w:val="24"/>
                 <w:u w:val="none"/>
@@ -1701,7 +1701,7 @@
             </w:pPr>
             <w:r>
               <w:rPr>
-                <w:rFonts w:ascii="Times New Roman" w:hAnsi="Times New Roman" w:cs="Times New Roman" w:eastAsia="Times New Roman"/>
+                <w:rFonts w:ascii="Arial" w:hAnsi="Arial" w:cs="Arial" w:eastAsia="Arial"/>
                 <w:b w:val="0"/>
                 <w:sz w:val="24"/>
                 <w:u w:val="none"/>
@@ -1723,7 +1723,7 @@
             </w:pPr>
             <w:r>
               <w:rPr>
-                <w:rFonts w:ascii="Times New Roman" w:hAnsi="Times New Roman" w:cs="Times New Roman" w:eastAsia="Times New Roman"/>
+                <w:rFonts w:ascii="Arial" w:hAnsi="Arial" w:cs="Arial" w:eastAsia="Arial"/>
                 <w:b w:val="0"/>
                 <w:sz w:val="24"/>
                 <w:u w:val="none"/>
@@ -1743,7 +1743,7 @@
             </w:pPr>
             <w:r>
               <w:rPr>
-                <w:rFonts w:ascii="Times New Roman" w:hAnsi="Times New Roman" w:cs="Times New Roman" w:eastAsia="Times New Roman"/>
+                <w:rFonts w:ascii="Arial" w:hAnsi="Arial" w:cs="Arial" w:eastAsia="Arial"/>
                 <w:b w:val="0"/>
                 <w:sz w:val="24"/>
                 <w:u w:val="none"/>
@@ -1763,7 +1763,7 @@
             </w:pPr>
             <w:r>
               <w:rPr>
-                <w:rFonts w:ascii="Times New Roman" w:hAnsi="Times New Roman" w:cs="Times New Roman" w:eastAsia="Times New Roman"/>
+                <w:rFonts w:ascii="Arial" w:hAnsi="Arial" w:cs="Arial" w:eastAsia="Arial"/>
                 <w:b w:val="0"/>
                 <w:sz w:val="24"/>
                 <w:u w:val="none"/>
@@ -1785,7 +1785,7 @@
             </w:pPr>
             <w:r>
               <w:rPr>
-                <w:rFonts w:ascii="Times New Roman" w:hAnsi="Times New Roman" w:cs="Times New Roman" w:eastAsia="Times New Roman"/>
+                <w:rFonts w:ascii="Arial" w:hAnsi="Arial" w:cs="Arial" w:eastAsia="Arial"/>
                 <w:b w:val="0"/>
                 <w:sz w:val="24"/>
                 <w:u w:val="none"/>
@@ -1805,7 +1805,7 @@
             </w:pPr>
             <w:r>
               <w:rPr>
-                <w:rFonts w:ascii="Times New Roman" w:hAnsi="Times New Roman" w:cs="Times New Roman" w:eastAsia="Times New Roman"/>
+                <w:rFonts w:ascii="Arial" w:hAnsi="Arial" w:cs="Arial" w:eastAsia="Arial"/>
                 <w:b w:val="0"/>
                 <w:sz w:val="24"/>
                 <w:u w:val="none"/>
@@ -1825,7 +1825,7 @@
             </w:pPr>
             <w:r>
               <w:rPr>
-                <w:rFonts w:ascii="Times New Roman" w:hAnsi="Times New Roman" w:cs="Times New Roman" w:eastAsia="Times New Roman"/>
+                <w:rFonts w:ascii="Arial" w:hAnsi="Arial" w:cs="Arial" w:eastAsia="Arial"/>
                 <w:b w:val="0"/>
                 <w:sz w:val="24"/>
                 <w:u w:val="none"/>
@@ -1847,7 +1847,7 @@
             </w:pPr>
             <w:r>
               <w:rPr>
-                <w:rFonts w:ascii="Times New Roman" w:hAnsi="Times New Roman" w:cs="Times New Roman" w:eastAsia="Times New Roman"/>
+                <w:rFonts w:ascii="Arial" w:hAnsi="Arial" w:cs="Arial" w:eastAsia="Arial"/>
                 <w:b w:val="0"/>
                 <w:sz w:val="24"/>
                 <w:u w:val="none"/>
@@ -1867,7 +1867,7 @@
             </w:pPr>
             <w:r>
               <w:rPr>
-                <w:rFonts w:ascii="Times New Roman" w:hAnsi="Times New Roman" w:cs="Times New Roman" w:eastAsia="Times New Roman"/>
+                <w:rFonts w:ascii="Arial" w:hAnsi="Arial" w:cs="Arial" w:eastAsia="Arial"/>
                 <w:b w:val="0"/>
                 <w:sz w:val="24"/>
                 <w:u w:val="none"/>
@@ -1887,7 +1887,7 @@
             </w:pPr>
             <w:r>
               <w:rPr>
-                <w:rFonts w:ascii="Times New Roman" w:hAnsi="Times New Roman" w:cs="Times New Roman" w:eastAsia="Times New Roman"/>
+                <w:rFonts w:ascii="Arial" w:hAnsi="Arial" w:cs="Arial" w:eastAsia="Arial"/>
                 <w:b w:val="0"/>
                 <w:sz w:val="24"/>
                 <w:u w:val="none"/>
@@ -1909,7 +1909,7 @@
             </w:pPr>
             <w:r>
               <w:rPr>
-                <w:rFonts w:ascii="Times New Roman" w:hAnsi="Times New Roman" w:cs="Times New Roman" w:eastAsia="Times New Roman"/>
+                <w:rFonts w:ascii="Arial" w:hAnsi="Arial" w:cs="Arial" w:eastAsia="Arial"/>
                 <w:b w:val="0"/>
                 <w:sz w:val="24"/>
                 <w:u w:val="none"/>
@@ -1929,7 +1929,7 @@
             </w:pPr>
             <w:r>
               <w:rPr>
-                <w:rFonts w:ascii="Times New Roman" w:hAnsi="Times New Roman" w:cs="Times New Roman" w:eastAsia="Times New Roman"/>
+                <w:rFonts w:ascii="Arial" w:hAnsi="Arial" w:cs="Arial" w:eastAsia="Arial"/>
                 <w:b w:val="0"/>
                 <w:sz w:val="24"/>
                 <w:u w:val="none"/>
@@ -1949,7 +1949,7 @@
             </w:pPr>
             <w:r>
               <w:rPr>
-                <w:rFonts w:ascii="Times New Roman" w:hAnsi="Times New Roman" w:cs="Times New Roman" w:eastAsia="Times New Roman"/>
+                <w:rFonts w:ascii="Arial" w:hAnsi="Arial" w:cs="Arial" w:eastAsia="Arial"/>
                 <w:b w:val="0"/>
                 <w:sz w:val="24"/>
                 <w:u w:val="none"/>
@@ -1971,7 +1971,7 @@
             </w:pPr>
             <w:r>
               <w:rPr>
-                <w:rFonts w:ascii="Times New Roman" w:hAnsi="Times New Roman" w:cs="Times New Roman" w:eastAsia="Times New Roman"/>
+                <w:rFonts w:ascii="Arial" w:hAnsi="Arial" w:cs="Arial" w:eastAsia="Arial"/>
                 <w:b w:val="0"/>
                 <w:sz w:val="24"/>
                 <w:u w:val="none"/>
@@ -1991,7 +1991,7 @@
             </w:pPr>
             <w:r>
               <w:rPr>
-                <w:rFonts w:ascii="Times New Roman" w:hAnsi="Times New Roman" w:cs="Times New Roman" w:eastAsia="Times New Roman"/>
+                <w:rFonts w:ascii="Arial" w:hAnsi="Arial" w:cs="Arial" w:eastAsia="Arial"/>
                 <w:b w:val="0"/>
                 <w:sz w:val="24"/>
                 <w:u w:val="none"/>
@@ -2011,7 +2011,7 @@
             </w:pPr>
             <w:r>
               <w:rPr>
-                <w:rFonts w:ascii="Times New Roman" w:hAnsi="Times New Roman" w:cs="Times New Roman" w:eastAsia="Times New Roman"/>
+                <w:rFonts w:ascii="Arial" w:hAnsi="Arial" w:cs="Arial" w:eastAsia="Arial"/>
                 <w:b w:val="0"/>
                 <w:sz w:val="24"/>
                 <w:u w:val="none"/>
@@ -2028,7 +2028,7 @@
       </w:pPr>
       <w:r>
         <w:rPr>
-          <w:rFonts w:ascii="Times New Roman" w:hAnsi="Times New Roman" w:cs="Times New Roman" w:eastAsia="Times New Roman"/>
+          <w:rFonts w:ascii="Arial" w:hAnsi="Arial" w:cs="Arial" w:eastAsia="Arial"/>
           <w:b/>
           <w:sz w:val="24"/>
           <w:u w:val="none"/>
@@ -2037,7 +2037,7 @@
       </w:r>
       <w:r>
         <w:rPr>
-          <w:rFonts w:ascii="Times New Roman" w:hAnsi="Times New Roman" w:cs="Times New Roman" w:eastAsia="Times New Roman"/>
+          <w:rFonts w:ascii="Arial" w:hAnsi="Arial" w:cs="Arial" w:eastAsia="Arial"/>
           <w:b w:val="0"/>
           <w:sz w:val="24"/>
           <w:u w:val="none"/>
@@ -2051,7 +2051,7 @@
       </w:pPr>
       <w:r>
         <w:rPr>
-          <w:rFonts w:ascii="Times New Roman" w:hAnsi="Times New Roman" w:cs="Times New Roman" w:eastAsia="Times New Roman"/>
+          <w:rFonts w:ascii="Arial" w:hAnsi="Arial" w:cs="Arial" w:eastAsia="Arial"/>
           <w:b/>
           <w:sz w:val="24"/>
           <w:u w:val="none"/>
@@ -2066,7 +2066,7 @@
       </w:pPr>
       <w:r>
         <w:rPr>
-          <w:rFonts w:ascii="Times New Roman" w:hAnsi="Times New Roman" w:cs="Times New Roman" w:eastAsia="Times New Roman"/>
+          <w:rFonts w:ascii="Arial" w:hAnsi="Arial" w:cs="Arial" w:eastAsia="Arial"/>
           <w:b/>
           <w:sz w:val="24"/>
           <w:u w:val="none"/>
@@ -2075,7 +2075,7 @@
       </w:r>
       <w:r>
         <w:rPr>
-          <w:rFonts w:ascii="Times New Roman" w:hAnsi="Times New Roman" w:cs="Times New Roman" w:eastAsia="Times New Roman"/>
+          <w:rFonts w:ascii="Arial" w:hAnsi="Arial" w:cs="Arial" w:eastAsia="Arial"/>
           <w:b w:val="0"/>
           <w:sz w:val="24"/>
           <w:u w:val="none"/>
@@ -2084,7 +2084,7 @@
       </w:r>
       <w:r>
         <w:rPr>
-          <w:rFonts w:ascii="Times New Roman" w:hAnsi="Times New Roman" w:cs="Times New Roman" w:eastAsia="Times New Roman"/>
+          <w:rFonts w:ascii="Arial" w:hAnsi="Arial" w:cs="Arial" w:eastAsia="Arial"/>
           <w:b/>
           <w:sz w:val="24"/>
           <w:u w:val="none"/>
@@ -2093,7 +2093,7 @@
       </w:r>
       <w:r>
         <w:rPr>
-          <w:rFonts w:ascii="Times New Roman" w:hAnsi="Times New Roman" w:cs="Times New Roman" w:eastAsia="Times New Roman"/>
+          <w:rFonts w:ascii="Arial" w:hAnsi="Arial" w:cs="Arial" w:eastAsia="Arial"/>
           <w:b w:val="0"/>
           <w:sz w:val="24"/>
           <w:u w:val="none"/>
@@ -2108,7 +2108,7 @@
       </w:pPr>
       <w:r>
         <w:rPr>
-          <w:rFonts w:ascii="Times New Roman" w:hAnsi="Times New Roman" w:cs="Times New Roman" w:eastAsia="Times New Roman"/>
+          <w:rFonts w:ascii="Arial" w:hAnsi="Arial" w:cs="Arial" w:eastAsia="Arial"/>
           <w:b/>
           <w:sz w:val="24"/>
           <w:u w:val="none"/>
@@ -2117,7 +2117,7 @@
       </w:r>
       <w:r>
         <w:rPr>
-          <w:rFonts w:ascii="Times New Roman" w:hAnsi="Times New Roman" w:cs="Times New Roman" w:eastAsia="Times New Roman"/>
+          <w:rFonts w:ascii="Arial" w:hAnsi="Arial" w:cs="Arial" w:eastAsia="Arial"/>
           <w:b w:val="0"/>
           <w:sz w:val="24"/>
           <w:u w:val="none"/>
@@ -2126,7 +2126,7 @@
       </w:r>
       <w:r>
         <w:rPr>
-          <w:rFonts w:ascii="Times New Roman" w:hAnsi="Times New Roman" w:cs="Times New Roman" w:eastAsia="Times New Roman"/>
+          <w:rFonts w:ascii="Arial" w:hAnsi="Arial" w:cs="Arial" w:eastAsia="Arial"/>
           <w:b/>
           <w:sz w:val="24"/>
           <w:u w:val="none"/>
@@ -2135,7 +2135,7 @@
       </w:r>
       <w:r>
         <w:rPr>
-          <w:rFonts w:ascii="Times New Roman" w:hAnsi="Times New Roman" w:cs="Times New Roman" w:eastAsia="Times New Roman"/>
+          <w:rFonts w:ascii="Arial" w:hAnsi="Arial" w:cs="Arial" w:eastAsia="Arial"/>
           <w:b w:val="0"/>
           <w:sz w:val="24"/>
           <w:u w:val="none"/>
@@ -2150,7 +2150,7 @@
       </w:pPr>
       <w:r>
         <w:rPr>
-          <w:rFonts w:ascii="Times New Roman" w:hAnsi="Times New Roman" w:cs="Times New Roman" w:eastAsia="Times New Roman"/>
+          <w:rFonts w:ascii="Arial" w:hAnsi="Arial" w:cs="Arial" w:eastAsia="Arial"/>
           <w:b/>
           <w:sz w:val="24"/>
           <w:u w:val="none"/>
@@ -2159,7 +2159,7 @@
       </w:r>
       <w:r>
         <w:rPr>
-          <w:rFonts w:ascii="Times New Roman" w:hAnsi="Times New Roman" w:cs="Times New Roman" w:eastAsia="Times New Roman"/>
+          <w:rFonts w:ascii="Arial" w:hAnsi="Arial" w:cs="Arial" w:eastAsia="Arial"/>
           <w:b w:val="0"/>
           <w:sz w:val="24"/>
           <w:u w:val="none"/>
@@ -2174,7 +2174,7 @@
       </w:pPr>
       <w:r>
         <w:rPr>
-          <w:rFonts w:ascii="Times New Roman" w:hAnsi="Times New Roman" w:cs="Times New Roman" w:eastAsia="Times New Roman"/>
+          <w:rFonts w:ascii="Arial" w:hAnsi="Arial" w:cs="Arial" w:eastAsia="Arial"/>
           <w:b w:val="0"/>
           <w:sz w:val="24"/>
           <w:u w:val="none"/>
@@ -2188,7 +2188,7 @@
       </w:pPr>
       <w:r>
         <w:rPr>
-          <w:rFonts w:ascii="Times New Roman" w:hAnsi="Times New Roman" w:cs="Times New Roman" w:eastAsia="Times New Roman"/>
+          <w:rFonts w:ascii="Arial" w:hAnsi="Arial" w:cs="Arial" w:eastAsia="Arial"/>
           <w:b/>
           <w:sz w:val="24"/>
           <w:u w:val="none"/>
@@ -2203,7 +2203,7 @@
       </w:pPr>
       <w:r>
         <w:rPr>
-          <w:rFonts w:ascii="Times New Roman" w:hAnsi="Times New Roman" w:cs="Times New Roman" w:eastAsia="Times New Roman"/>
+          <w:rFonts w:ascii="Arial" w:hAnsi="Arial" w:cs="Arial" w:eastAsia="Arial"/>
           <w:b/>
           <w:sz w:val="24"/>
           <w:u w:val="none"/>
@@ -2212,12 +2212,12 @@
       </w:r>
       <w:r>
         <w:rPr>
-          <w:rFonts w:ascii="Times New Roman" w:hAnsi="Times New Roman" w:cs="Times New Roman" w:eastAsia="Times New Roman"/>
+          <w:rFonts w:ascii="Arial" w:hAnsi="Arial" w:cs="Arial" w:eastAsia="Arial"/>
           <w:b w:val="0"/>
           <w:sz w:val="24"/>
           <w:u w:val="none"/>
         </w:rPr>
-        <w:t xml:space="preserve"> {{sum_total}} руб. Без НДС</w:t>
+        <w:t xml:space="preserve"> {{sum_total}} руб. ({{sum_total_words}}) Без НДС</w:t>
       </w:r>
     </w:p>
     <w:p>
@@ -2226,7 +2226,7 @@
       </w:pPr>
       <w:r>
         <w:rPr>
-          <w:rFonts w:ascii="Times New Roman" w:hAnsi="Times New Roman" w:cs="Times New Roman" w:eastAsia="Times New Roman"/>
+          <w:rFonts w:ascii="Arial" w:hAnsi="Arial" w:cs="Arial" w:eastAsia="Arial"/>
           <w:b/>
           <w:sz w:val="24"/>
           <w:u w:val="none"/>
@@ -2240,7 +2240,7 @@
       </w:pPr>
       <w:r>
         <w:rPr>
-          <w:rFonts w:ascii="Times New Roman" w:hAnsi="Times New Roman" w:cs="Times New Roman" w:eastAsia="Times New Roman"/>
+          <w:rFonts w:ascii="Arial" w:hAnsi="Arial" w:cs="Arial" w:eastAsia="Arial"/>
           <w:b w:val="0"/>
           <w:sz w:val="24"/>
           <w:u w:val="none"/>
@@ -2255,7 +2255,7 @@
       </w:pPr>
       <w:r>
         <w:rPr>
-          <w:rFonts w:ascii="Times New Roman" w:hAnsi="Times New Roman" w:cs="Times New Roman" w:eastAsia="Times New Roman"/>
+          <w:rFonts w:ascii="Arial" w:hAnsi="Arial" w:cs="Arial" w:eastAsia="Arial"/>
           <w:b w:val="0"/>
           <w:sz w:val="24"/>
           <w:u w:val="none"/>
@@ -2269,7 +2269,7 @@
       </w:pPr>
       <w:r>
         <w:rPr>
-          <w:rFonts w:ascii="Times New Roman" w:hAnsi="Times New Roman" w:cs="Times New Roman" w:eastAsia="Times New Roman"/>
+          <w:rFonts w:ascii="Arial" w:hAnsi="Arial" w:cs="Arial" w:eastAsia="Arial"/>
           <w:b w:val="0"/>
           <w:sz w:val="24"/>
           <w:u w:val="none"/>
@@ -2283,7 +2283,7 @@
       </w:pPr>
       <w:r>
         <w:rPr>
-          <w:rFonts w:ascii="Times New Roman" w:hAnsi="Times New Roman" w:cs="Times New Roman" w:eastAsia="Times New Roman"/>
+          <w:rFonts w:ascii="Arial" w:hAnsi="Arial" w:cs="Arial" w:eastAsia="Arial"/>
           <w:b/>
           <w:sz w:val="24"/>
           <w:u w:val="none"/>
@@ -2297,7 +2297,7 @@
       </w:pPr>
       <w:r>
         <w:rPr>
-          <w:rFonts w:ascii="Times New Roman" w:hAnsi="Times New Roman" w:cs="Times New Roman" w:eastAsia="Times New Roman"/>
+          <w:rFonts w:ascii="Arial" w:hAnsi="Arial" w:cs="Arial" w:eastAsia="Arial"/>
           <w:b w:val="0"/>
           <w:sz w:val="24"/>
           <w:u w:val="none"/>
@@ -2311,7 +2311,7 @@
       </w:pPr>
       <w:r>
         <w:rPr>
-          <w:rFonts w:ascii="Times New Roman" w:hAnsi="Times New Roman" w:cs="Times New Roman" w:eastAsia="Times New Roman"/>
+          <w:rFonts w:ascii="Arial" w:hAnsi="Arial" w:cs="Arial" w:eastAsia="Arial"/>
           <w:b w:val="0"/>
           <w:sz w:val="24"/>
           <w:u w:val="none"/>
@@ -2325,7 +2325,7 @@
       </w:pPr>
       <w:r>
         <w:rPr>
-          <w:rFonts w:ascii="Times New Roman" w:hAnsi="Times New Roman" w:cs="Times New Roman" w:eastAsia="Times New Roman"/>
+          <w:rFonts w:ascii="Arial" w:hAnsi="Arial" w:cs="Arial" w:eastAsia="Arial"/>
           <w:b/>
           <w:sz w:val="24"/>
           <w:u w:val="none"/>
@@ -2339,7 +2339,7 @@
       </w:pPr>
       <w:r>
         <w:rPr>
-          <w:rFonts w:ascii="Times New Roman" w:hAnsi="Times New Roman" w:cs="Times New Roman" w:eastAsia="Times New Roman"/>
+          <w:rFonts w:ascii="Arial" w:hAnsi="Arial" w:cs="Arial" w:eastAsia="Arial"/>
           <w:b w:val="0"/>
           <w:sz w:val="24"/>
           <w:u w:val="none"/>
@@ -2353,7 +2353,7 @@
       </w:pPr>
       <w:r>
         <w:rPr>
-          <w:rFonts w:ascii="Times New Roman" w:hAnsi="Times New Roman" w:cs="Times New Roman" w:eastAsia="Times New Roman"/>
+          <w:rFonts w:ascii="Arial" w:hAnsi="Arial" w:cs="Arial" w:eastAsia="Arial"/>
           <w:b w:val="0"/>
           <w:sz w:val="24"/>
           <w:u w:val="none"/>
@@ -2735,7 +2735,7 @@
     <w:qFormat/>
     <w:rsid w:val="00FC693F"/>
     <w:rPr>
-      <w:rFonts w:ascii="Times New Roman" w:hAnsi="Times New Roman" w:cs="Times New Roman" w:eastAsia="Times New Roman"/>
+      <w:rFonts w:ascii="Arial" w:hAnsi="Arial" w:cs="Arial" w:eastAsia="Arial"/>
       <w:sz w:val="24"/>
     </w:rPr>
   </w:style>

</xml_diff>